<commit_message>
Clarify the research question wording
The question is whether the market follows star recommendations because stars
are more accurate or because investors defer to their status, not whether the
recommendation itself is accurate.

Co-Authored-By: Claude Code <noreply@anthropic.com>
</commit_message>
<xml_diff>
--- a/文档/Project10_明星分析师_研究方案.docx
+++ b/文档/Project10_明星分析师_研究方案.docx
@@ -639,7 +639,7 @@
         </w:rPr>
         <w:fldChar w:fldCharType="separate"/>
       </w:r>
-      <w:hyperlink w:anchor="_Toc243215585" w:history="1">
+      <w:hyperlink w:anchor="_Toc243217453" w:history="1">
         <w:r>
           <w:rPr>
             <w:rStyle w:val="aff9"/>
@@ -685,7 +685,7 @@
             <w:noProof/>
             <w:webHidden/>
           </w:rPr>
-          <w:instrText>PAGEREF _Toc243215585 \h</w:instrText>
+          <w:instrText>PAGEREF _Toc243217453 \h</w:instrText>
         </w:r>
         <w:r>
           <w:rPr>
@@ -743,7 +743,7 @@
           <w14:ligatures w14:val="standardContextual"/>
         </w:rPr>
       </w:pPr>
-      <w:hyperlink w:anchor="_Toc243215586" w:history="1">
+      <w:hyperlink w:anchor="_Toc243217454" w:history="1">
         <w:r>
           <w:rPr>
             <w:rStyle w:val="aff9"/>
@@ -789,7 +789,7 @@
             <w:noProof/>
             <w:webHidden/>
           </w:rPr>
-          <w:instrText>PAGEREF _Toc243215586 \h</w:instrText>
+          <w:instrText>PAGEREF _Toc243217454 \h</w:instrText>
         </w:r>
         <w:r>
           <w:rPr>
@@ -848,7 +848,7 @@
           <w14:ligatures w14:val="standardContextual"/>
         </w:rPr>
       </w:pPr>
-      <w:hyperlink w:anchor="_Toc243215587" w:history="1">
+      <w:hyperlink w:anchor="_Toc243217455" w:history="1">
         <w:r>
           <w:rPr>
             <w:rStyle w:val="aff9"/>
@@ -894,7 +894,7 @@
             <w:noProof/>
             <w:webHidden/>
           </w:rPr>
-          <w:instrText>PAGEREF _Toc243215587 \h</w:instrText>
+          <w:instrText>PAGEREF _Toc243217455 \h</w:instrText>
         </w:r>
         <w:r>
           <w:rPr>
@@ -953,7 +953,7 @@
           <w14:ligatures w14:val="standardContextual"/>
         </w:rPr>
       </w:pPr>
-      <w:hyperlink w:anchor="_Toc243215588" w:history="1">
+      <w:hyperlink w:anchor="_Toc243217456" w:history="1">
         <w:r>
           <w:rPr>
             <w:rStyle w:val="aff9"/>
@@ -999,7 +999,7 @@
             <w:noProof/>
             <w:webHidden/>
           </w:rPr>
-          <w:instrText>PAGEREF _Toc243215588 \h</w:instrText>
+          <w:instrText>PAGEREF _Toc243217456 \h</w:instrText>
         </w:r>
         <w:r>
           <w:rPr>
@@ -1058,7 +1058,7 @@
           <w14:ligatures w14:val="standardContextual"/>
         </w:rPr>
       </w:pPr>
-      <w:hyperlink w:anchor="_Toc243215589" w:history="1">
+      <w:hyperlink w:anchor="_Toc243217457" w:history="1">
         <w:r>
           <w:rPr>
             <w:rStyle w:val="aff9"/>
@@ -1104,7 +1104,7 @@
             <w:noProof/>
             <w:webHidden/>
           </w:rPr>
-          <w:instrText>PAGEREF _Toc243215589 \h</w:instrText>
+          <w:instrText>PAGEREF _Toc243217457 \h</w:instrText>
         </w:r>
         <w:r>
           <w:rPr>
@@ -1163,7 +1163,7 @@
           <w14:ligatures w14:val="standardContextual"/>
         </w:rPr>
       </w:pPr>
-      <w:hyperlink w:anchor="_Toc243215590" w:history="1">
+      <w:hyperlink w:anchor="_Toc243217458" w:history="1">
         <w:r>
           <w:rPr>
             <w:rStyle w:val="aff9"/>
@@ -1209,7 +1209,7 @@
             <w:noProof/>
             <w:webHidden/>
           </w:rPr>
-          <w:instrText>PAGEREF _Toc243215590 \h</w:instrText>
+          <w:instrText>PAGEREF _Toc243217458 \h</w:instrText>
         </w:r>
         <w:r>
           <w:rPr>
@@ -1267,7 +1267,7 @@
           <w14:ligatures w14:val="standardContextual"/>
         </w:rPr>
       </w:pPr>
-      <w:hyperlink w:anchor="_Toc243215591" w:history="1">
+      <w:hyperlink w:anchor="_Toc243217459" w:history="1">
         <w:r>
           <w:rPr>
             <w:rStyle w:val="aff9"/>
@@ -1329,7 +1329,7 @@
             <w:noProof/>
             <w:webHidden/>
           </w:rPr>
-          <w:instrText>PAGEREF _Toc243215591 \h</w:instrText>
+          <w:instrText>PAGEREF _Toc243217459 \h</w:instrText>
         </w:r>
         <w:r>
           <w:rPr>
@@ -1388,7 +1388,7 @@
           <w14:ligatures w14:val="standardContextual"/>
         </w:rPr>
       </w:pPr>
-      <w:hyperlink w:anchor="_Toc243215592" w:history="1">
+      <w:hyperlink w:anchor="_Toc243217460" w:history="1">
         <w:r>
           <w:rPr>
             <w:rStyle w:val="aff9"/>
@@ -1434,7 +1434,7 @@
             <w:noProof/>
             <w:webHidden/>
           </w:rPr>
-          <w:instrText>PAGEREF _Toc243215592 \h</w:instrText>
+          <w:instrText>PAGEREF _Toc243217460 \h</w:instrText>
         </w:r>
         <w:r>
           <w:rPr>
@@ -1493,7 +1493,7 @@
           <w14:ligatures w14:val="standardContextual"/>
         </w:rPr>
       </w:pPr>
-      <w:hyperlink w:anchor="_Toc243215593" w:history="1">
+      <w:hyperlink w:anchor="_Toc243217461" w:history="1">
         <w:r>
           <w:rPr>
             <w:rStyle w:val="aff9"/>
@@ -1539,7 +1539,7 @@
             <w:noProof/>
             <w:webHidden/>
           </w:rPr>
-          <w:instrText>PAGEREF _Toc243215593 \h</w:instrText>
+          <w:instrText>PAGEREF _Toc243217461 \h</w:instrText>
         </w:r>
         <w:r>
           <w:rPr>
@@ -1598,7 +1598,7 @@
           <w14:ligatures w14:val="standardContextual"/>
         </w:rPr>
       </w:pPr>
-      <w:hyperlink w:anchor="_Toc243215594" w:history="1">
+      <w:hyperlink w:anchor="_Toc243217462" w:history="1">
         <w:r>
           <w:rPr>
             <w:rStyle w:val="aff9"/>
@@ -1708,7 +1708,7 @@
             <w:noProof/>
             <w:webHidden/>
           </w:rPr>
-          <w:instrText>PAGEREF _Toc243215594 \h</w:instrText>
+          <w:instrText>PAGEREF _Toc243217462 \h</w:instrText>
         </w:r>
         <w:r>
           <w:rPr>
@@ -1766,7 +1766,7 @@
           <w14:ligatures w14:val="standardContextual"/>
         </w:rPr>
       </w:pPr>
-      <w:hyperlink w:anchor="_Toc243215595" w:history="1">
+      <w:hyperlink w:anchor="_Toc243217463" w:history="1">
         <w:r>
           <w:rPr>
             <w:rStyle w:val="aff9"/>
@@ -1812,7 +1812,7 @@
             <w:noProof/>
             <w:webHidden/>
           </w:rPr>
-          <w:instrText>PAGEREF _Toc243215595 \h</w:instrText>
+          <w:instrText>PAGEREF _Toc243217463 \h</w:instrText>
         </w:r>
         <w:r>
           <w:rPr>
@@ -1871,7 +1871,7 @@
           <w14:ligatures w14:val="standardContextual"/>
         </w:rPr>
       </w:pPr>
-      <w:hyperlink w:anchor="_Toc243215596" w:history="1">
+      <w:hyperlink w:anchor="_Toc243217464" w:history="1">
         <w:r>
           <w:rPr>
             <w:rStyle w:val="aff9"/>
@@ -1917,7 +1917,7 @@
             <w:noProof/>
             <w:webHidden/>
           </w:rPr>
-          <w:instrText>PAGEREF _Toc243215596 \h</w:instrText>
+          <w:instrText>PAGEREF _Toc243217464 \h</w:instrText>
         </w:r>
         <w:r>
           <w:rPr>
@@ -1976,7 +1976,7 @@
           <w14:ligatures w14:val="standardContextual"/>
         </w:rPr>
       </w:pPr>
-      <w:hyperlink w:anchor="_Toc243215597" w:history="1">
+      <w:hyperlink w:anchor="_Toc243217465" w:history="1">
         <w:r>
           <w:rPr>
             <w:rStyle w:val="aff9"/>
@@ -2022,7 +2022,7 @@
             <w:noProof/>
             <w:webHidden/>
           </w:rPr>
-          <w:instrText>PAGEREF _Toc243215597 \h</w:instrText>
+          <w:instrText>PAGEREF _Toc243217465 \h</w:instrText>
         </w:r>
         <w:r>
           <w:rPr>
@@ -2081,7 +2081,7 @@
           <w14:ligatures w14:val="standardContextual"/>
         </w:rPr>
       </w:pPr>
-      <w:hyperlink w:anchor="_Toc243215598" w:history="1">
+      <w:hyperlink w:anchor="_Toc243217466" w:history="1">
         <w:r>
           <w:rPr>
             <w:rStyle w:val="aff9"/>
@@ -2127,7 +2127,7 @@
             <w:noProof/>
             <w:webHidden/>
           </w:rPr>
-          <w:instrText>PAGEREF _Toc243215598 \h</w:instrText>
+          <w:instrText>PAGEREF _Toc243217466 \h</w:instrText>
         </w:r>
         <w:r>
           <w:rPr>
@@ -2186,7 +2186,7 @@
           <w14:ligatures w14:val="standardContextual"/>
         </w:rPr>
       </w:pPr>
-      <w:hyperlink w:anchor="_Toc243215599" w:history="1">
+      <w:hyperlink w:anchor="_Toc243217467" w:history="1">
         <w:r>
           <w:rPr>
             <w:rStyle w:val="aff9"/>
@@ -2232,7 +2232,7 @@
             <w:noProof/>
             <w:webHidden/>
           </w:rPr>
-          <w:instrText>PAGEREF _Toc243215599 \h</w:instrText>
+          <w:instrText>PAGEREF _Toc243217467 \h</w:instrText>
         </w:r>
         <w:r>
           <w:rPr>
@@ -2291,7 +2291,7 @@
           <w14:ligatures w14:val="standardContextual"/>
         </w:rPr>
       </w:pPr>
-      <w:hyperlink w:anchor="_Toc243215600" w:history="1">
+      <w:hyperlink w:anchor="_Toc243217468" w:history="1">
         <w:r>
           <w:rPr>
             <w:rStyle w:val="aff9"/>
@@ -2337,7 +2337,7 @@
             <w:noProof/>
             <w:webHidden/>
           </w:rPr>
-          <w:instrText>PAGEREF _Toc243215600 \h</w:instrText>
+          <w:instrText>PAGEREF _Toc243217468 \h</w:instrText>
         </w:r>
         <w:r>
           <w:rPr>
@@ -2395,7 +2395,7 @@
           <w14:ligatures w14:val="standardContextual"/>
         </w:rPr>
       </w:pPr>
-      <w:hyperlink w:anchor="_Toc243215601" w:history="1">
+      <w:hyperlink w:anchor="_Toc243217469" w:history="1">
         <w:r>
           <w:rPr>
             <w:rStyle w:val="aff9"/>
@@ -2441,7 +2441,7 @@
             <w:noProof/>
             <w:webHidden/>
           </w:rPr>
-          <w:instrText>PAGEREF _Toc243215601 \h</w:instrText>
+          <w:instrText>PAGEREF _Toc243217469 \h</w:instrText>
         </w:r>
         <w:r>
           <w:rPr>
@@ -2500,7 +2500,7 @@
           <w14:ligatures w14:val="standardContextual"/>
         </w:rPr>
       </w:pPr>
-      <w:hyperlink w:anchor="_Toc243215602" w:history="1">
+      <w:hyperlink w:anchor="_Toc243217470" w:history="1">
         <w:r>
           <w:rPr>
             <w:rStyle w:val="aff9"/>
@@ -2546,7 +2546,7 @@
             <w:noProof/>
             <w:webHidden/>
           </w:rPr>
-          <w:instrText>PAGEREF _Toc243215602 \h</w:instrText>
+          <w:instrText>PAGEREF _Toc243217470 \h</w:instrText>
         </w:r>
         <w:r>
           <w:rPr>
@@ -2605,7 +2605,7 @@
           <w14:ligatures w14:val="standardContextual"/>
         </w:rPr>
       </w:pPr>
-      <w:hyperlink w:anchor="_Toc243215603" w:history="1">
+      <w:hyperlink w:anchor="_Toc243217471" w:history="1">
         <w:r>
           <w:rPr>
             <w:rStyle w:val="aff9"/>
@@ -2667,7 +2667,7 @@
             <w:noProof/>
             <w:webHidden/>
           </w:rPr>
-          <w:instrText>PAGEREF _Toc243215603 \h</w:instrText>
+          <w:instrText>PAGEREF _Toc243217471 \h</w:instrText>
         </w:r>
         <w:r>
           <w:rPr>
@@ -2726,7 +2726,7 @@
           <w14:ligatures w14:val="standardContextual"/>
         </w:rPr>
       </w:pPr>
-      <w:hyperlink w:anchor="_Toc243215604" w:history="1">
+      <w:hyperlink w:anchor="_Toc243217472" w:history="1">
         <w:r>
           <w:rPr>
             <w:rStyle w:val="aff9"/>
@@ -2772,7 +2772,7 @@
             <w:noProof/>
             <w:webHidden/>
           </w:rPr>
-          <w:instrText>PAGEREF _Toc243215604 \h</w:instrText>
+          <w:instrText>PAGEREF _Toc243217472 \h</w:instrText>
         </w:r>
         <w:r>
           <w:rPr>
@@ -2831,7 +2831,7 @@
           <w14:ligatures w14:val="standardContextual"/>
         </w:rPr>
       </w:pPr>
-      <w:hyperlink w:anchor="_Toc243215605" w:history="1">
+      <w:hyperlink w:anchor="_Toc243217473" w:history="1">
         <w:r>
           <w:rPr>
             <w:rStyle w:val="aff9"/>
@@ -2941,7 +2941,7 @@
             <w:noProof/>
             <w:webHidden/>
           </w:rPr>
-          <w:instrText>PAGEREF _Toc243215605 \h</w:instrText>
+          <w:instrText>PAGEREF _Toc243217473 \h</w:instrText>
         </w:r>
         <w:r>
           <w:rPr>
@@ -2999,7 +2999,7 @@
           <w14:ligatures w14:val="standardContextual"/>
         </w:rPr>
       </w:pPr>
-      <w:hyperlink w:anchor="_Toc243215606" w:history="1">
+      <w:hyperlink w:anchor="_Toc243217474" w:history="1">
         <w:r>
           <w:rPr>
             <w:rStyle w:val="aff9"/>
@@ -3045,7 +3045,7 @@
             <w:noProof/>
             <w:webHidden/>
           </w:rPr>
-          <w:instrText>PAGEREF _Toc243215606 \h</w:instrText>
+          <w:instrText>PAGEREF _Toc243217474 \h</w:instrText>
         </w:r>
         <w:r>
           <w:rPr>
@@ -3104,7 +3104,7 @@
           <w14:ligatures w14:val="standardContextual"/>
         </w:rPr>
       </w:pPr>
-      <w:hyperlink w:anchor="_Toc243215607" w:history="1">
+      <w:hyperlink w:anchor="_Toc243217475" w:history="1">
         <w:r>
           <w:rPr>
             <w:rStyle w:val="aff9"/>
@@ -3174,7 +3174,7 @@
             <w:noProof/>
             <w:webHidden/>
           </w:rPr>
-          <w:instrText>PAGEREF _Toc243215607 \h</w:instrText>
+          <w:instrText>PAGEREF _Toc243217475 \h</w:instrText>
         </w:r>
         <w:r>
           <w:rPr>
@@ -3233,7 +3233,7 @@
           <w14:ligatures w14:val="standardContextual"/>
         </w:rPr>
       </w:pPr>
-      <w:hyperlink w:anchor="_Toc243215608" w:history="1">
+      <w:hyperlink w:anchor="_Toc243217476" w:history="1">
         <w:r>
           <w:rPr>
             <w:rStyle w:val="aff9"/>
@@ -3303,7 +3303,7 @@
             <w:noProof/>
             <w:webHidden/>
           </w:rPr>
-          <w:instrText>PAGEREF _Toc243215608 \h</w:instrText>
+          <w:instrText>PAGEREF _Toc243217476 \h</w:instrText>
         </w:r>
         <w:r>
           <w:rPr>
@@ -3362,7 +3362,7 @@
           <w14:ligatures w14:val="standardContextual"/>
         </w:rPr>
       </w:pPr>
-      <w:hyperlink w:anchor="_Toc243215609" w:history="1">
+      <w:hyperlink w:anchor="_Toc243217477" w:history="1">
         <w:r>
           <w:rPr>
             <w:rStyle w:val="aff9"/>
@@ -3432,7 +3432,7 @@
             <w:noProof/>
             <w:webHidden/>
           </w:rPr>
-          <w:instrText>PAGEREF _Toc243215609 \h</w:instrText>
+          <w:instrText>PAGEREF _Toc243217477 \h</w:instrText>
         </w:r>
         <w:r>
           <w:rPr>
@@ -3491,7 +3491,7 @@
           <w14:ligatures w14:val="standardContextual"/>
         </w:rPr>
       </w:pPr>
-      <w:hyperlink w:anchor="_Toc243215610" w:history="1">
+      <w:hyperlink w:anchor="_Toc243217478" w:history="1">
         <w:r>
           <w:rPr>
             <w:rStyle w:val="aff9"/>
@@ -3561,7 +3561,7 @@
             <w:noProof/>
             <w:webHidden/>
           </w:rPr>
-          <w:instrText>PAGEREF _Toc243215610 \h</w:instrText>
+          <w:instrText>PAGEREF _Toc243217478 \h</w:instrText>
         </w:r>
         <w:r>
           <w:rPr>
@@ -3620,7 +3620,7 @@
           <w14:ligatures w14:val="standardContextual"/>
         </w:rPr>
       </w:pPr>
-      <w:hyperlink w:anchor="_Toc243215611" w:history="1">
+      <w:hyperlink w:anchor="_Toc243217479" w:history="1">
         <w:r>
           <w:rPr>
             <w:rStyle w:val="aff9"/>
@@ -3674,7 +3674,7 @@
             <w:noProof/>
             <w:webHidden/>
           </w:rPr>
-          <w:instrText>PAGEREF _Toc243215611 \h</w:instrText>
+          <w:instrText>PAGEREF _Toc243217479 \h</w:instrText>
         </w:r>
         <w:r>
           <w:rPr>
@@ -3732,7 +3732,7 @@
           <w14:ligatures w14:val="standardContextual"/>
         </w:rPr>
       </w:pPr>
-      <w:hyperlink w:anchor="_Toc243215612" w:history="1">
+      <w:hyperlink w:anchor="_Toc243217480" w:history="1">
         <w:r>
           <w:rPr>
             <w:rStyle w:val="aff9"/>
@@ -3778,7 +3778,7 @@
             <w:noProof/>
             <w:webHidden/>
           </w:rPr>
-          <w:instrText>PAGEREF _Toc243215612 \h</w:instrText>
+          <w:instrText>PAGEREF _Toc243217480 \h</w:instrText>
         </w:r>
         <w:r>
           <w:rPr>
@@ -3836,7 +3836,7 @@
           <w14:ligatures w14:val="standardContextual"/>
         </w:rPr>
       </w:pPr>
-      <w:hyperlink w:anchor="_Toc243215613" w:history="1">
+      <w:hyperlink w:anchor="_Toc243217481" w:history="1">
         <w:r>
           <w:rPr>
             <w:rStyle w:val="aff9"/>
@@ -3882,7 +3882,7 @@
             <w:noProof/>
             <w:webHidden/>
           </w:rPr>
-          <w:instrText>PAGEREF _Toc243215613 \h</w:instrText>
+          <w:instrText>PAGEREF _Toc243217481 \h</w:instrText>
         </w:r>
         <w:r>
           <w:rPr>
@@ -3940,7 +3940,7 @@
           <w14:ligatures w14:val="standardContextual"/>
         </w:rPr>
       </w:pPr>
-      <w:hyperlink w:anchor="_Toc243215614" w:history="1">
+      <w:hyperlink w:anchor="_Toc243217482" w:history="1">
         <w:r>
           <w:rPr>
             <w:rStyle w:val="aff9"/>
@@ -4002,7 +4002,7 @@
             <w:noProof/>
             <w:webHidden/>
           </w:rPr>
-          <w:instrText>PAGEREF _Toc243215614 \h</w:instrText>
+          <w:instrText>PAGEREF _Toc243217482 \h</w:instrText>
         </w:r>
         <w:r>
           <w:rPr>
@@ -4060,7 +4060,7 @@
           <w14:ligatures w14:val="standardContextual"/>
         </w:rPr>
       </w:pPr>
-      <w:hyperlink w:anchor="_Toc243215615" w:history="1">
+      <w:hyperlink w:anchor="_Toc243217483" w:history="1">
         <w:r>
           <w:rPr>
             <w:rStyle w:val="aff9"/>
@@ -4138,7 +4138,7 @@
             <w:noProof/>
             <w:webHidden/>
           </w:rPr>
-          <w:instrText>PAGEREF _Toc243215615 \h</w:instrText>
+          <w:instrText>PAGEREF _Toc243217483 \h</w:instrText>
         </w:r>
         <w:r>
           <w:rPr>
@@ -4197,7 +4197,7 @@
           <w14:ligatures w14:val="standardContextual"/>
         </w:rPr>
       </w:pPr>
-      <w:hyperlink w:anchor="_Toc243215616" w:history="1">
+      <w:hyperlink w:anchor="_Toc243217484" w:history="1">
         <w:r>
           <w:rPr>
             <w:rStyle w:val="aff9"/>
@@ -4275,7 +4275,7 @@
             <w:noProof/>
             <w:webHidden/>
           </w:rPr>
-          <w:instrText>PAGEREF _Toc243215616 \h</w:instrText>
+          <w:instrText>PAGEREF _Toc243217484 \h</w:instrText>
         </w:r>
         <w:r>
           <w:rPr>
@@ -4334,7 +4334,7 @@
           <w14:ligatures w14:val="standardContextual"/>
         </w:rPr>
       </w:pPr>
-      <w:hyperlink w:anchor="_Toc243215617" w:history="1">
+      <w:hyperlink w:anchor="_Toc243217485" w:history="1">
         <w:r>
           <w:rPr>
             <w:rStyle w:val="aff9"/>
@@ -4444,7 +4444,7 @@
             <w:noProof/>
             <w:webHidden/>
           </w:rPr>
-          <w:instrText>PAGEREF _Toc243215617 \h</w:instrText>
+          <w:instrText>PAGEREF _Toc243217485 \h</w:instrText>
         </w:r>
         <w:r>
           <w:rPr>
@@ -4503,7 +4503,7 @@
           <w14:ligatures w14:val="standardContextual"/>
         </w:rPr>
       </w:pPr>
-      <w:hyperlink w:anchor="_Toc243215618" w:history="1">
+      <w:hyperlink w:anchor="_Toc243217486" w:history="1">
         <w:r>
           <w:rPr>
             <w:rStyle w:val="aff9"/>
@@ -4549,7 +4549,7 @@
             <w:noProof/>
             <w:webHidden/>
           </w:rPr>
-          <w:instrText>PAGEREF _Toc243215618 \h</w:instrText>
+          <w:instrText>PAGEREF _Toc243217486 \h</w:instrText>
         </w:r>
         <w:r>
           <w:rPr>
@@ -4607,7 +4607,7 @@
           <w14:ligatures w14:val="standardContextual"/>
         </w:rPr>
       </w:pPr>
-      <w:hyperlink w:anchor="_Toc243215619" w:history="1">
+      <w:hyperlink w:anchor="_Toc243217487" w:history="1">
         <w:r>
           <w:rPr>
             <w:rStyle w:val="aff9"/>
@@ -4669,7 +4669,7 @@
             <w:noProof/>
             <w:webHidden/>
           </w:rPr>
-          <w:instrText>PAGEREF _Toc243215619 \h</w:instrText>
+          <w:instrText>PAGEREF _Toc243217487 \h</w:instrText>
         </w:r>
         <w:r>
           <w:rPr>
@@ -4728,7 +4728,7 @@
           <w14:ligatures w14:val="standardContextual"/>
         </w:rPr>
       </w:pPr>
-      <w:hyperlink w:anchor="_Toc243215620" w:history="1">
+      <w:hyperlink w:anchor="_Toc243217488" w:history="1">
         <w:r>
           <w:rPr>
             <w:rStyle w:val="aff9"/>
@@ -4774,7 +4774,7 @@
             <w:noProof/>
             <w:webHidden/>
           </w:rPr>
-          <w:instrText>PAGEREF _Toc243215620 \h</w:instrText>
+          <w:instrText>PAGEREF _Toc243217488 \h</w:instrText>
         </w:r>
         <w:r>
           <w:rPr>
@@ -4832,7 +4832,7 @@
           <w14:ligatures w14:val="standardContextual"/>
         </w:rPr>
       </w:pPr>
-      <w:hyperlink w:anchor="_Toc243215621" w:history="1">
+      <w:hyperlink w:anchor="_Toc243217489" w:history="1">
         <w:r>
           <w:rPr>
             <w:rStyle w:val="aff9"/>
@@ -4894,7 +4894,7 @@
             <w:noProof/>
             <w:webHidden/>
           </w:rPr>
-          <w:instrText>PAGEREF _Toc243215621 \h</w:instrText>
+          <w:instrText>PAGEREF _Toc243217489 \h</w:instrText>
         </w:r>
         <w:r>
           <w:rPr>
@@ -4952,7 +4952,7 @@
           <w14:ligatures w14:val="standardContextual"/>
         </w:rPr>
       </w:pPr>
-      <w:hyperlink w:anchor="_Toc243215622" w:history="1">
+      <w:hyperlink w:anchor="_Toc243217490" w:history="1">
         <w:r>
           <w:rPr>
             <w:rStyle w:val="aff9"/>
@@ -4998,7 +4998,7 @@
             <w:noProof/>
             <w:webHidden/>
           </w:rPr>
-          <w:instrText>PAGEREF _Toc243215622 \h</w:instrText>
+          <w:instrText>PAGEREF _Toc243217490 \h</w:instrText>
         </w:r>
         <w:r>
           <w:rPr>
@@ -5057,7 +5057,7 @@
           <w14:ligatures w14:val="standardContextual"/>
         </w:rPr>
       </w:pPr>
-      <w:hyperlink w:anchor="_Toc243215623" w:history="1">
+      <w:hyperlink w:anchor="_Toc243217491" w:history="1">
         <w:r>
           <w:rPr>
             <w:rStyle w:val="aff9"/>
@@ -5103,7 +5103,7 @@
             <w:noProof/>
             <w:webHidden/>
           </w:rPr>
-          <w:instrText>PAGEREF _Toc243215623 \h</w:instrText>
+          <w:instrText>PAGEREF _Toc243217491 \h</w:instrText>
         </w:r>
         <w:r>
           <w:rPr>
@@ -5162,7 +5162,7 @@
           <w14:ligatures w14:val="standardContextual"/>
         </w:rPr>
       </w:pPr>
-      <w:hyperlink w:anchor="_Toc243215624" w:history="1">
+      <w:hyperlink w:anchor="_Toc243217492" w:history="1">
         <w:r>
           <w:rPr>
             <w:rStyle w:val="aff9"/>
@@ -5208,7 +5208,7 @@
             <w:noProof/>
             <w:webHidden/>
           </w:rPr>
-          <w:instrText>PAGEREF _Toc243215624 \h</w:instrText>
+          <w:instrText>PAGEREF _Toc243217492 \h</w:instrText>
         </w:r>
         <w:r>
           <w:rPr>
@@ -5267,7 +5267,7 @@
           <w14:ligatures w14:val="standardContextual"/>
         </w:rPr>
       </w:pPr>
-      <w:hyperlink w:anchor="_Toc243215625" w:history="1">
+      <w:hyperlink w:anchor="_Toc243217493" w:history="1">
         <w:r>
           <w:rPr>
             <w:rStyle w:val="aff9"/>
@@ -5313,7 +5313,7 @@
             <w:noProof/>
             <w:webHidden/>
           </w:rPr>
-          <w:instrText>PAGEREF _Toc243215625 \h</w:instrText>
+          <w:instrText>PAGEREF _Toc243217493 \h</w:instrText>
         </w:r>
         <w:r>
           <w:rPr>
@@ -5371,7 +5371,7 @@
           <w14:ligatures w14:val="standardContextual"/>
         </w:rPr>
       </w:pPr>
-      <w:hyperlink w:anchor="_Toc243215626" w:history="1">
+      <w:hyperlink w:anchor="_Toc243217494" w:history="1">
         <w:r>
           <w:rPr>
             <w:rStyle w:val="aff9"/>
@@ -5417,7 +5417,7 @@
             <w:noProof/>
             <w:webHidden/>
           </w:rPr>
-          <w:instrText>PAGEREF _Toc243215626 \h</w:instrText>
+          <w:instrText>PAGEREF _Toc243217494 \h</w:instrText>
         </w:r>
         <w:r>
           <w:rPr>
@@ -5475,7 +5475,7 @@
           <w14:ligatures w14:val="standardContextual"/>
         </w:rPr>
       </w:pPr>
-      <w:hyperlink w:anchor="_Toc243215627" w:history="1">
+      <w:hyperlink w:anchor="_Toc243217495" w:history="1">
         <w:r>
           <w:rPr>
             <w:rStyle w:val="aff9"/>
@@ -5521,7 +5521,7 @@
             <w:noProof/>
             <w:webHidden/>
           </w:rPr>
-          <w:instrText>PAGEREF _Toc243215627 \h</w:instrText>
+          <w:instrText>PAGEREF _Toc243217495 \h</w:instrText>
         </w:r>
         <w:r>
           <w:rPr>
@@ -5579,7 +5579,7 @@
           <w14:ligatures w14:val="standardContextual"/>
         </w:rPr>
       </w:pPr>
-      <w:hyperlink w:anchor="_Toc243215628" w:history="1">
+      <w:hyperlink w:anchor="_Toc243217496" w:history="1">
         <w:r>
           <w:rPr>
             <w:rStyle w:val="aff9"/>
@@ -5625,7 +5625,7 @@
             <w:noProof/>
             <w:webHidden/>
           </w:rPr>
-          <w:instrText>PAGEREF _Toc243215628 \h</w:instrText>
+          <w:instrText>PAGEREF _Toc243217496 \h</w:instrText>
         </w:r>
         <w:r>
           <w:rPr>
@@ -5684,7 +5684,7 @@
           <w14:ligatures w14:val="standardContextual"/>
         </w:rPr>
       </w:pPr>
-      <w:hyperlink w:anchor="_Toc243215629" w:history="1">
+      <w:hyperlink w:anchor="_Toc243217497" w:history="1">
         <w:r>
           <w:rPr>
             <w:rStyle w:val="aff9"/>
@@ -5746,7 +5746,7 @@
             <w:noProof/>
             <w:webHidden/>
           </w:rPr>
-          <w:instrText>PAGEREF _Toc243215629 \h</w:instrText>
+          <w:instrText>PAGEREF _Toc243217497 \h</w:instrText>
         </w:r>
         <w:r>
           <w:rPr>
@@ -5805,7 +5805,7 @@
           <w14:ligatures w14:val="standardContextual"/>
         </w:rPr>
       </w:pPr>
-      <w:hyperlink w:anchor="_Toc243215630" w:history="1">
+      <w:hyperlink w:anchor="_Toc243217498" w:history="1">
         <w:r>
           <w:rPr>
             <w:rStyle w:val="aff9"/>
@@ -5851,7 +5851,7 @@
             <w:noProof/>
             <w:webHidden/>
           </w:rPr>
-          <w:instrText>PAGEREF _Toc243215630 \h</w:instrText>
+          <w:instrText>PAGEREF _Toc243217498 \h</w:instrText>
         </w:r>
         <w:r>
           <w:rPr>
@@ -5910,7 +5910,7 @@
           <w14:ligatures w14:val="standardContextual"/>
         </w:rPr>
       </w:pPr>
-      <w:hyperlink w:anchor="_Toc243215631" w:history="1">
+      <w:hyperlink w:anchor="_Toc243217499" w:history="1">
         <w:r>
           <w:rPr>
             <w:rStyle w:val="aff9"/>
@@ -5956,7 +5956,7 @@
             <w:noProof/>
             <w:webHidden/>
           </w:rPr>
-          <w:instrText>PAGEREF _Toc243215631 \h</w:instrText>
+          <w:instrText>PAGEREF _Toc243217499 \h</w:instrText>
         </w:r>
         <w:r>
           <w:rPr>
@@ -6015,7 +6015,7 @@
           <w14:ligatures w14:val="standardContextual"/>
         </w:rPr>
       </w:pPr>
-      <w:hyperlink w:anchor="_Toc243215632" w:history="1">
+      <w:hyperlink w:anchor="_Toc243217500" w:history="1">
         <w:r>
           <w:rPr>
             <w:rStyle w:val="aff9"/>
@@ -6061,7 +6061,7 @@
             <w:noProof/>
             <w:webHidden/>
           </w:rPr>
-          <w:instrText>PAGEREF _Toc243215632 \h</w:instrText>
+          <w:instrText>PAGEREF _Toc243217500 \h</w:instrText>
         </w:r>
         <w:r>
           <w:rPr>
@@ -6120,7 +6120,7 @@
           <w14:ligatures w14:val="standardContextual"/>
         </w:rPr>
       </w:pPr>
-      <w:hyperlink w:anchor="_Toc243215633" w:history="1">
+      <w:hyperlink w:anchor="_Toc243217501" w:history="1">
         <w:r>
           <w:rPr>
             <w:rStyle w:val="aff9"/>
@@ -6166,7 +6166,7 @@
             <w:noProof/>
             <w:webHidden/>
           </w:rPr>
-          <w:instrText>PAGEREF _Toc243215633 \h</w:instrText>
+          <w:instrText>PAGEREF _Toc243217501 \h</w:instrText>
         </w:r>
         <w:r>
           <w:rPr>
@@ -6221,7 +6221,7 @@
         <w:pStyle w:val="1"/>
         <w:spacing w:before="280" w:after="120"/>
       </w:pPr>
-      <w:bookmarkStart w:id="0" w:name="_Toc243215585"/>
+      <w:bookmarkStart w:id="0" w:name="_Toc243217453"/>
       <w:r>
         <w:rPr>
           <w:rFonts w:ascii="Times New Roman" w:eastAsia="黑体" w:hAnsi="Times New Roman"/>
@@ -6533,7 +6533,7 @@
                 <w:color w:val="000000"/>
                 <w:sz w:val="21"/>
               </w:rPr>
-              <w:t>明星分析师是</w:t>
+              <w:t>市场跟随明星分析师的推荐，是因为他们</w:t>
             </w:r>
             <w:r>
               <w:rPr>
@@ -6575,35 +6575,7 @@
                 <w:color w:val="000000"/>
                 <w:sz w:val="21"/>
               </w:rPr>
-              <w:t>能力），还是</w:t>
-            </w:r>
-            <w:r>
-              <w:rPr>
-                <w:color w:val="000000"/>
-                <w:sz w:val="21"/>
-              </w:rPr>
-              <w:t>"</w:t>
-            </w:r>
-            <w:r>
-              <w:rPr>
-                <w:color w:val="000000"/>
-                <w:sz w:val="21"/>
-              </w:rPr>
-              <w:t>更被追随</w:t>
-            </w:r>
-            <w:r>
-              <w:rPr>
-                <w:color w:val="000000"/>
-                <w:sz w:val="21"/>
-              </w:rPr>
-              <w:t>"</w:t>
-            </w:r>
-            <w:r>
-              <w:rPr>
-                <w:color w:val="000000"/>
-                <w:sz w:val="21"/>
-              </w:rPr>
-              <w:t>（地位</w:t>
+              <w:t>能力），还是因为投资者盲从名气（地位</w:t>
             </w:r>
             <w:r>
               <w:rPr>
@@ -7351,7 +7323,7 @@
         <w:pStyle w:val="1"/>
         <w:spacing w:before="280" w:after="120"/>
       </w:pPr>
-      <w:bookmarkStart w:id="1" w:name="_Toc243215586"/>
+      <w:bookmarkStart w:id="1" w:name="_Toc243217454"/>
       <w:r>
         <w:rPr>
           <w:rFonts w:ascii="Times New Roman" w:eastAsia="黑体" w:hAnsi="Times New Roman"/>
@@ -7375,7 +7347,7 @@
         <w:pStyle w:val="21"/>
         <w:spacing w:after="120"/>
       </w:pPr>
-      <w:bookmarkStart w:id="2" w:name="_Toc243215587"/>
+      <w:bookmarkStart w:id="2" w:name="_Toc243217455"/>
       <w:r>
         <w:rPr>
           <w:rFonts w:ascii="Times New Roman" w:eastAsia="黑体" w:hAnsi="Times New Roman"/>
@@ -7550,7 +7522,7 @@
         <w:pStyle w:val="21"/>
         <w:spacing w:after="120"/>
       </w:pPr>
-      <w:bookmarkStart w:id="3" w:name="_Toc243215588"/>
+      <w:bookmarkStart w:id="3" w:name="_Toc243217456"/>
       <w:r>
         <w:rPr>
           <w:rFonts w:ascii="Times New Roman" w:eastAsia="黑体" w:hAnsi="Times New Roman"/>
@@ -7771,7 +7743,7 @@
         <w:pStyle w:val="21"/>
         <w:spacing w:after="120"/>
       </w:pPr>
-      <w:bookmarkStart w:id="4" w:name="_Toc243215589"/>
+      <w:bookmarkStart w:id="4" w:name="_Toc243217457"/>
       <w:r>
         <w:rPr>
           <w:rFonts w:ascii="Times New Roman" w:eastAsia="黑体" w:hAnsi="Times New Roman"/>
@@ -7969,7 +7941,7 @@
         <w:pStyle w:val="21"/>
         <w:spacing w:after="120"/>
       </w:pPr>
-      <w:bookmarkStart w:id="5" w:name="_Toc243215590"/>
+      <w:bookmarkStart w:id="5" w:name="_Toc243217458"/>
       <w:r>
         <w:rPr>
           <w:rFonts w:ascii="Times New Roman" w:eastAsia="黑体" w:hAnsi="Times New Roman"/>
@@ -8319,7 +8291,7 @@
         <w:pStyle w:val="1"/>
         <w:spacing w:before="280" w:after="120"/>
       </w:pPr>
-      <w:bookmarkStart w:id="6" w:name="_Toc243215591"/>
+      <w:bookmarkStart w:id="6" w:name="_Toc243217459"/>
       <w:r>
         <w:rPr>
           <w:rFonts w:ascii="Times New Roman" w:eastAsia="黑体" w:hAnsi="Times New Roman"/>
@@ -8367,7 +8339,7 @@
         <w:pStyle w:val="21"/>
         <w:spacing w:after="120"/>
       </w:pPr>
-      <w:bookmarkStart w:id="7" w:name="_Toc243215592"/>
+      <w:bookmarkStart w:id="7" w:name="_Toc243217460"/>
       <w:r>
         <w:rPr>
           <w:rFonts w:ascii="Times New Roman" w:eastAsia="黑体" w:hAnsi="Times New Roman"/>
@@ -8808,7 +8780,7 @@
         <w:pStyle w:val="21"/>
         <w:spacing w:after="120"/>
       </w:pPr>
-      <w:bookmarkStart w:id="8" w:name="_Toc243215593"/>
+      <w:bookmarkStart w:id="8" w:name="_Toc243217461"/>
       <w:r>
         <w:rPr>
           <w:rFonts w:ascii="Times New Roman" w:eastAsia="黑体" w:hAnsi="Times New Roman"/>
@@ -9264,7 +9236,7 @@
         <w:pStyle w:val="21"/>
         <w:spacing w:after="120"/>
       </w:pPr>
-      <w:bookmarkStart w:id="9" w:name="_Toc243215594"/>
+      <w:bookmarkStart w:id="9" w:name="_Toc243217462"/>
       <w:r>
         <w:rPr>
           <w:rFonts w:ascii="Times New Roman" w:eastAsia="黑体" w:hAnsi="Times New Roman"/>
@@ -9768,7 +9740,7 @@
         <w:pStyle w:val="1"/>
         <w:spacing w:before="280" w:after="120"/>
       </w:pPr>
-      <w:bookmarkStart w:id="10" w:name="_Toc243215595"/>
+      <w:bookmarkStart w:id="10" w:name="_Toc243217463"/>
       <w:r>
         <w:rPr>
           <w:rFonts w:ascii="Times New Roman" w:eastAsia="黑体" w:hAnsi="Times New Roman"/>
@@ -9792,7 +9764,7 @@
         <w:pStyle w:val="21"/>
         <w:spacing w:after="120"/>
       </w:pPr>
-      <w:bookmarkStart w:id="11" w:name="_Toc243215596"/>
+      <w:bookmarkStart w:id="11" w:name="_Toc243217464"/>
       <w:r>
         <w:rPr>
           <w:rFonts w:ascii="Times New Roman" w:eastAsia="黑体" w:hAnsi="Times New Roman"/>
@@ -10232,7 +10204,7 @@
         <w:pStyle w:val="21"/>
         <w:spacing w:after="120"/>
       </w:pPr>
-      <w:bookmarkStart w:id="12" w:name="_Toc243215597"/>
+      <w:bookmarkStart w:id="12" w:name="_Toc243217465"/>
       <w:r>
         <w:rPr>
           <w:rFonts w:ascii="Times New Roman" w:eastAsia="黑体" w:hAnsi="Times New Roman"/>
@@ -11173,7 +11145,7 @@
         <w:pStyle w:val="21"/>
         <w:spacing w:after="120"/>
       </w:pPr>
-      <w:bookmarkStart w:id="13" w:name="_Toc243215598"/>
+      <w:bookmarkStart w:id="13" w:name="_Toc243217466"/>
       <w:r>
         <w:rPr>
           <w:rFonts w:ascii="Times New Roman" w:eastAsia="黑体" w:hAnsi="Times New Roman"/>
@@ -11620,7 +11592,7 @@
         <w:pStyle w:val="21"/>
         <w:spacing w:after="120"/>
       </w:pPr>
-      <w:bookmarkStart w:id="14" w:name="_Toc243215599"/>
+      <w:bookmarkStart w:id="14" w:name="_Toc243217467"/>
       <w:r>
         <w:rPr>
           <w:rFonts w:ascii="Times New Roman" w:eastAsia="黑体" w:hAnsi="Times New Roman"/>
@@ -11944,7 +11916,7 @@
         <w:pStyle w:val="21"/>
         <w:spacing w:after="120"/>
       </w:pPr>
-      <w:bookmarkStart w:id="15" w:name="_Toc243215600"/>
+      <w:bookmarkStart w:id="15" w:name="_Toc243217468"/>
       <w:r>
         <w:rPr>
           <w:rFonts w:ascii="Times New Roman" w:eastAsia="黑体" w:hAnsi="Times New Roman"/>
@@ -12103,7 +12075,7 @@
         <w:pStyle w:val="1"/>
         <w:spacing w:before="280" w:after="120"/>
       </w:pPr>
-      <w:bookmarkStart w:id="16" w:name="_Toc243215601"/>
+      <w:bookmarkStart w:id="16" w:name="_Toc243217469"/>
       <w:r>
         <w:rPr>
           <w:rFonts w:ascii="Times New Roman" w:eastAsia="黑体" w:hAnsi="Times New Roman"/>
@@ -12202,7 +12174,7 @@
         <w:pStyle w:val="21"/>
         <w:spacing w:after="120"/>
       </w:pPr>
-      <w:bookmarkStart w:id="17" w:name="_Toc243215602"/>
+      <w:bookmarkStart w:id="17" w:name="_Toc243217470"/>
       <w:r>
         <w:rPr>
           <w:rFonts w:ascii="Times New Roman" w:eastAsia="黑体" w:hAnsi="Times New Roman"/>
@@ -12710,7 +12682,7 @@
         <w:pStyle w:val="21"/>
         <w:spacing w:after="120"/>
       </w:pPr>
-      <w:bookmarkStart w:id="18" w:name="_Toc243215603"/>
+      <w:bookmarkStart w:id="18" w:name="_Toc243217471"/>
       <w:r>
         <w:rPr>
           <w:rFonts w:ascii="Times New Roman" w:eastAsia="黑体" w:hAnsi="Times New Roman"/>
@@ -13243,7 +13215,7 @@
         <w:pStyle w:val="21"/>
         <w:spacing w:after="120"/>
       </w:pPr>
-      <w:bookmarkStart w:id="19" w:name="_Toc243215604"/>
+      <w:bookmarkStart w:id="19" w:name="_Toc243217472"/>
       <w:r>
         <w:rPr>
           <w:rFonts w:ascii="Times New Roman" w:eastAsia="黑体" w:hAnsi="Times New Roman"/>
@@ -13668,7 +13640,7 @@
         <w:pStyle w:val="21"/>
         <w:spacing w:after="120"/>
       </w:pPr>
-      <w:bookmarkStart w:id="20" w:name="_Toc243215605"/>
+      <w:bookmarkStart w:id="20" w:name="_Toc243217473"/>
       <w:r>
         <w:rPr>
           <w:rFonts w:ascii="Times New Roman" w:eastAsia="黑体" w:hAnsi="Times New Roman"/>
@@ -14485,7 +14457,7 @@
         <w:pStyle w:val="1"/>
         <w:spacing w:before="280" w:after="120"/>
       </w:pPr>
-      <w:bookmarkStart w:id="21" w:name="_Toc243215606"/>
+      <w:bookmarkStart w:id="21" w:name="_Toc243217474"/>
       <w:r>
         <w:rPr>
           <w:rFonts w:ascii="Times New Roman" w:eastAsia="黑体" w:hAnsi="Times New Roman"/>
@@ -14804,7 +14776,7 @@
         <w:pStyle w:val="21"/>
         <w:spacing w:after="120"/>
       </w:pPr>
-      <w:bookmarkStart w:id="22" w:name="_Toc243215607"/>
+      <w:bookmarkStart w:id="22" w:name="_Toc243217475"/>
       <w:r>
         <w:rPr>
           <w:rFonts w:ascii="Times New Roman" w:eastAsia="黑体" w:hAnsi="Times New Roman"/>
@@ -14993,7 +14965,7 @@
         <w:pStyle w:val="21"/>
         <w:spacing w:after="120"/>
       </w:pPr>
-      <w:bookmarkStart w:id="23" w:name="_Toc243215608"/>
+      <w:bookmarkStart w:id="23" w:name="_Toc243217476"/>
       <w:r>
         <w:rPr>
           <w:rFonts w:ascii="Times New Roman" w:eastAsia="黑体" w:hAnsi="Times New Roman"/>
@@ -15206,7 +15178,7 @@
         <w:pStyle w:val="21"/>
         <w:spacing w:after="120"/>
       </w:pPr>
-      <w:bookmarkStart w:id="24" w:name="_Toc243215609"/>
+      <w:bookmarkStart w:id="24" w:name="_Toc243217477"/>
       <w:r>
         <w:rPr>
           <w:rFonts w:ascii="Times New Roman" w:eastAsia="黑体" w:hAnsi="Times New Roman"/>
@@ -15463,7 +15435,7 @@
         <w:pStyle w:val="21"/>
         <w:spacing w:after="120"/>
       </w:pPr>
-      <w:bookmarkStart w:id="25" w:name="_Toc243215610"/>
+      <w:bookmarkStart w:id="25" w:name="_Toc243217478"/>
       <w:r>
         <w:rPr>
           <w:rFonts w:ascii="Times New Roman" w:eastAsia="黑体" w:hAnsi="Times New Roman"/>
@@ -15603,7 +15575,7 @@
         <w:pStyle w:val="21"/>
         <w:spacing w:after="120"/>
       </w:pPr>
-      <w:bookmarkStart w:id="26" w:name="_Toc243215611"/>
+      <w:bookmarkStart w:id="26" w:name="_Toc243217479"/>
       <w:r>
         <w:rPr>
           <w:rFonts w:ascii="Times New Roman" w:eastAsia="黑体" w:hAnsi="Times New Roman"/>
@@ -15770,7 +15742,7 @@
         <w:pStyle w:val="1"/>
         <w:spacing w:before="280" w:after="120"/>
       </w:pPr>
-      <w:bookmarkStart w:id="27" w:name="_Toc243215612"/>
+      <w:bookmarkStart w:id="27" w:name="_Toc243217480"/>
       <w:r>
         <w:rPr>
           <w:rFonts w:ascii="Times New Roman" w:eastAsia="黑体" w:hAnsi="Times New Roman"/>
@@ -16372,7 +16344,7 @@
         <w:pStyle w:val="1"/>
         <w:spacing w:before="280" w:after="120"/>
       </w:pPr>
-      <w:bookmarkStart w:id="28" w:name="_Toc243215613"/>
+      <w:bookmarkStart w:id="28" w:name="_Toc243217481"/>
       <w:r>
         <w:rPr>
           <w:rFonts w:ascii="Times New Roman" w:eastAsia="黑体" w:hAnsi="Times New Roman"/>
@@ -16785,7 +16757,7 @@
         <w:pStyle w:val="1"/>
         <w:spacing w:before="280" w:after="120"/>
       </w:pPr>
-      <w:bookmarkStart w:id="29" w:name="_Toc243215614"/>
+      <w:bookmarkStart w:id="29" w:name="_Toc243217482"/>
       <w:r>
         <w:rPr>
           <w:rFonts w:ascii="Times New Roman" w:eastAsia="黑体" w:hAnsi="Times New Roman"/>
@@ -17388,7 +17360,7 @@
         <w:pStyle w:val="1"/>
         <w:spacing w:before="280" w:after="120"/>
       </w:pPr>
-      <w:bookmarkStart w:id="30" w:name="_Toc243215615"/>
+      <w:bookmarkStart w:id="30" w:name="_Toc243217483"/>
       <w:r>
         <w:rPr>
           <w:rFonts w:ascii="Times New Roman" w:eastAsia="黑体" w:hAnsi="Times New Roman"/>
@@ -17525,7 +17497,7 @@
         <w:pStyle w:val="21"/>
         <w:spacing w:after="120"/>
       </w:pPr>
-      <w:bookmarkStart w:id="31" w:name="_Toc243215616"/>
+      <w:bookmarkStart w:id="31" w:name="_Toc243217484"/>
       <w:r>
         <w:rPr>
           <w:rFonts w:ascii="Times New Roman" w:eastAsia="黑体" w:hAnsi="Times New Roman"/>
@@ -18102,7 +18074,7 @@
         <w:pStyle w:val="21"/>
         <w:spacing w:after="120"/>
       </w:pPr>
-      <w:bookmarkStart w:id="32" w:name="_Toc243215617"/>
+      <w:bookmarkStart w:id="32" w:name="_Toc243217485"/>
       <w:r>
         <w:rPr>
           <w:rFonts w:ascii="Times New Roman" w:eastAsia="黑体" w:hAnsi="Times New Roman"/>
@@ -19135,7 +19107,7 @@
         <w:pStyle w:val="21"/>
         <w:spacing w:after="120"/>
       </w:pPr>
-      <w:bookmarkStart w:id="33" w:name="_Toc243215618"/>
+      <w:bookmarkStart w:id="33" w:name="_Toc243217486"/>
       <w:r>
         <w:rPr>
           <w:rFonts w:ascii="Times New Roman" w:eastAsia="黑体" w:hAnsi="Times New Roman"/>
@@ -19350,7 +19322,7 @@
         <w:pStyle w:val="1"/>
         <w:spacing w:before="280" w:after="120"/>
       </w:pPr>
-      <w:bookmarkStart w:id="34" w:name="_Toc243215619"/>
+      <w:bookmarkStart w:id="34" w:name="_Toc243217487"/>
       <w:r>
         <w:rPr>
           <w:rFonts w:ascii="Times New Roman" w:eastAsia="黑体" w:hAnsi="Times New Roman"/>
@@ -20890,7 +20862,7 @@
         <w:pStyle w:val="21"/>
         <w:spacing w:after="120"/>
       </w:pPr>
-      <w:bookmarkStart w:id="35" w:name="_Toc243215620"/>
+      <w:bookmarkStart w:id="35" w:name="_Toc243217488"/>
       <w:r>
         <w:rPr>
           <w:rFonts w:ascii="Times New Roman" w:eastAsia="黑体" w:hAnsi="Times New Roman"/>
@@ -21601,7 +21573,7 @@
         <w:pStyle w:val="1"/>
         <w:spacing w:before="280" w:after="120"/>
       </w:pPr>
-      <w:bookmarkStart w:id="36" w:name="_Toc243215621"/>
+      <w:bookmarkStart w:id="36" w:name="_Toc243217489"/>
       <w:r>
         <w:rPr>
           <w:rFonts w:ascii="Times New Roman" w:eastAsia="黑体" w:hAnsi="Times New Roman"/>
@@ -21933,7 +21905,7 @@
         <w:pStyle w:val="1"/>
         <w:spacing w:before="280" w:after="120"/>
       </w:pPr>
-      <w:bookmarkStart w:id="37" w:name="_Toc243215622"/>
+      <w:bookmarkStart w:id="37" w:name="_Toc243217490"/>
       <w:r>
         <w:rPr>
           <w:rFonts w:ascii="Times New Roman" w:eastAsia="黑体" w:hAnsi="Times New Roman"/>
@@ -21957,7 +21929,7 @@
         <w:pStyle w:val="21"/>
         <w:spacing w:after="120"/>
       </w:pPr>
-      <w:bookmarkStart w:id="38" w:name="_Toc243215623"/>
+      <w:bookmarkStart w:id="38" w:name="_Toc243217491"/>
       <w:r>
         <w:rPr>
           <w:rFonts w:ascii="Times New Roman" w:eastAsia="黑体" w:hAnsi="Times New Roman"/>
@@ -22244,7 +22216,7 @@
         <w:pStyle w:val="21"/>
         <w:spacing w:after="120"/>
       </w:pPr>
-      <w:bookmarkStart w:id="39" w:name="_Toc243215624"/>
+      <w:bookmarkStart w:id="39" w:name="_Toc243217492"/>
       <w:r>
         <w:rPr>
           <w:rFonts w:ascii="Times New Roman" w:eastAsia="黑体" w:hAnsi="Times New Roman"/>
@@ -22450,7 +22422,7 @@
         <w:pStyle w:val="21"/>
         <w:spacing w:after="120"/>
       </w:pPr>
-      <w:bookmarkStart w:id="40" w:name="_Toc243215625"/>
+      <w:bookmarkStart w:id="40" w:name="_Toc243217493"/>
       <w:r>
         <w:rPr>
           <w:rFonts w:ascii="Times New Roman" w:eastAsia="黑体" w:hAnsi="Times New Roman"/>
@@ -22628,7 +22600,7 @@
         <w:pStyle w:val="1"/>
         <w:spacing w:before="280" w:after="120"/>
       </w:pPr>
-      <w:bookmarkStart w:id="41" w:name="_Toc243215626"/>
+      <w:bookmarkStart w:id="41" w:name="_Toc243217494"/>
       <w:r>
         <w:rPr>
           <w:rFonts w:ascii="Times New Roman" w:eastAsia="黑体" w:hAnsi="Times New Roman"/>
@@ -23250,7 +23222,7 @@
         <w:pStyle w:val="1"/>
         <w:spacing w:before="280" w:after="120"/>
       </w:pPr>
-      <w:bookmarkStart w:id="42" w:name="_Toc243215627"/>
+      <w:bookmarkStart w:id="42" w:name="_Toc243217495"/>
       <w:r>
         <w:rPr>
           <w:rFonts w:ascii="Times New Roman" w:eastAsia="黑体" w:hAnsi="Times New Roman"/>
@@ -23297,7 +23269,7 @@
         <w:pStyle w:val="1"/>
         <w:spacing w:before="280" w:after="120"/>
       </w:pPr>
-      <w:bookmarkStart w:id="43" w:name="_Toc243215628"/>
+      <w:bookmarkStart w:id="43" w:name="_Toc243217496"/>
       <w:r>
         <w:rPr>
           <w:rFonts w:ascii="Times New Roman" w:eastAsia="黑体" w:hAnsi="Times New Roman"/>
@@ -23365,7 +23337,7 @@
         <w:pStyle w:val="21"/>
         <w:spacing w:after="120"/>
       </w:pPr>
-      <w:bookmarkStart w:id="44" w:name="_Toc243215629"/>
+      <w:bookmarkStart w:id="44" w:name="_Toc243217497"/>
       <w:r>
         <w:rPr>
           <w:rFonts w:ascii="Times New Roman" w:eastAsia="黑体" w:hAnsi="Times New Roman"/>
@@ -23958,7 +23930,7 @@
         <w:pStyle w:val="21"/>
         <w:spacing w:after="120"/>
       </w:pPr>
-      <w:bookmarkStart w:id="45" w:name="_Toc243215630"/>
+      <w:bookmarkStart w:id="45" w:name="_Toc243217498"/>
       <w:r>
         <w:rPr>
           <w:rFonts w:ascii="Times New Roman" w:eastAsia="黑体" w:hAnsi="Times New Roman"/>
@@ -24557,7 +24529,7 @@
         <w:pStyle w:val="21"/>
         <w:spacing w:after="120"/>
       </w:pPr>
-      <w:bookmarkStart w:id="46" w:name="_Toc243215631"/>
+      <w:bookmarkStart w:id="46" w:name="_Toc243217499"/>
       <w:r>
         <w:rPr>
           <w:rFonts w:ascii="Times New Roman" w:eastAsia="黑体" w:hAnsi="Times New Roman"/>
@@ -24897,7 +24869,7 @@
         <w:pStyle w:val="21"/>
         <w:spacing w:after="120"/>
       </w:pPr>
-      <w:bookmarkStart w:id="47" w:name="_Toc243215632"/>
+      <w:bookmarkStart w:id="47" w:name="_Toc243217500"/>
       <w:r>
         <w:rPr>
           <w:rFonts w:ascii="Times New Roman" w:eastAsia="黑体" w:hAnsi="Times New Roman"/>
@@ -25473,7 +25445,7 @@
         <w:pStyle w:val="21"/>
         <w:spacing w:after="120"/>
       </w:pPr>
-      <w:bookmarkStart w:id="48" w:name="_Toc243215633"/>
+      <w:bookmarkStart w:id="48" w:name="_Toc243217501"/>
       <w:r>
         <w:rPr>
           <w:rFonts w:ascii="Times New Roman" w:eastAsia="黑体" w:hAnsi="Times New Roman"/>
@@ -26958,31 +26930,31 @@
       </w:rPr>
     </w:lvl>
   </w:abstractNum>
-  <w:num w:numId="1" w16cid:durableId="497043740">
+  <w:num w:numId="1" w16cid:durableId="388382611">
     <w:abstractNumId w:val="8"/>
   </w:num>
-  <w:num w:numId="2" w16cid:durableId="1426724759">
+  <w:num w:numId="2" w16cid:durableId="2040427926">
     <w:abstractNumId w:val="6"/>
   </w:num>
-  <w:num w:numId="3" w16cid:durableId="41751493">
+  <w:num w:numId="3" w16cid:durableId="1941452939">
     <w:abstractNumId w:val="5"/>
   </w:num>
-  <w:num w:numId="4" w16cid:durableId="1947079396">
+  <w:num w:numId="4" w16cid:durableId="1091776680">
     <w:abstractNumId w:val="4"/>
   </w:num>
-  <w:num w:numId="5" w16cid:durableId="1019544251">
+  <w:num w:numId="5" w16cid:durableId="2055039523">
     <w:abstractNumId w:val="7"/>
   </w:num>
-  <w:num w:numId="6" w16cid:durableId="407768439">
+  <w:num w:numId="6" w16cid:durableId="1630237020">
     <w:abstractNumId w:val="3"/>
   </w:num>
-  <w:num w:numId="7" w16cid:durableId="1678776590">
+  <w:num w:numId="7" w16cid:durableId="1117259831">
     <w:abstractNumId w:val="2"/>
   </w:num>
-  <w:num w:numId="8" w16cid:durableId="1479416260">
+  <w:num w:numId="8" w16cid:durableId="1005937961">
     <w:abstractNumId w:val="1"/>
   </w:num>
-  <w:num w:numId="9" w16cid:durableId="1596399361">
+  <w:num w:numId="9" w16cid:durableId="2057853517">
     <w:abstractNumId w:val="0"/>
   </w:num>
 </w:numbering>
@@ -38381,7 +38353,7 @@
     <w:autoRedefine/>
     <w:uiPriority w:val="39"/>
     <w:unhideWhenUsed/>
-    <w:rsid w:val="00380028"/>
+    <w:rsid w:val="004F13B9"/>
   </w:style>
   <w:style w:type="paragraph" w:styleId="TOC2">
     <w:name w:val="toc 2"/>
@@ -38390,7 +38362,7 @@
     <w:autoRedefine/>
     <w:uiPriority w:val="39"/>
     <w:unhideWhenUsed/>
-    <w:rsid w:val="00380028"/>
+    <w:rsid w:val="004F13B9"/>
     <w:pPr>
       <w:ind w:leftChars="200" w:left="420"/>
     </w:pPr>
@@ -38400,7 +38372,7 @@
     <w:basedOn w:val="a2"/>
     <w:uiPriority w:val="99"/>
     <w:unhideWhenUsed/>
-    <w:rsid w:val="00380028"/>
+    <w:rsid w:val="004F13B9"/>
     <w:rPr>
       <w:color w:val="0000FF" w:themeColor="hyperlink"/>
       <w:u w:val="single"/>

</xml_diff>